<commit_message>
Cao trình đỉnh đập: kw tra Bảng A2 TCVN 8421:2010; ghi rõ công thức xấp xỉ đồ thị sóng; bỏ công thức thời gian gió thổi không có nguồn
TCVN 8421:2010 cho chiều cao, chu kỳ sóng nước sâu bằng đồ thị (đường bao trên Hình 1). Excel và Word ghi rõ công thức
gh/V2, gτ/V là công thức xấp xỉ đường bao (Krưlốp). Bỏ công thức quy đổi thời gian gió thổi sang đà gió (hệ số 4,03;
1,6 – không có nguồn): với t = 6 giờ, gt/V ≈ 10^4, điều kiện thời gian không khống chế; Excel có ô nhập giá trị đọc
đồ thị. kw tra Bảng A2 (V <= 20 m/s lấy 2,1·10^-6). cao_trinh_dinh.tinh_truong_hop thêm tùy chọn kw_tra_bang (mặc định
giữ cách cũ cho các script khác). Zđ = +78,87 m không đổi; Δh tăng 1 ÷ 2 mm.

Co-Authored-By: Claude Opus 5.5 <noreply@anthropic.com>
Claude-Session: https://claude.ai/code/session_01FZ7RkEfpZxiJWB6royQwfj
</commit_message>
<xml_diff>
--- a/DATN_HoCaGiay/TAI_VE/Muc2.3_CaoTrinhDinhDap.docx
+++ b/DATN_HoCaGiay/TAI_VE/Muc2.3_CaoTrinhDinhDap.docx
@@ -352,7 +352,7 @@
           <w:i w:val="0"/>
           <w:sz w:val="26"/>
         </w:rPr>
-        <w:t>Độ dềnh do gió và sóng leo được tính theo TCVN 8421:2010:</w:t>
+        <w:t>Độ dềnh do gió và chiều cao sóng leo được tính theo TCVN 8421:2010:</w:t>
       </w:r>
     </w:p>
     <w:p>
@@ -452,7 +452,55 @@
           <w:rPr>
             <w:rFonts w:ascii="Cambria Math" w:hAnsi="Cambria Math"/>
           </w:rPr>
-          <m:t xml:space="preserve"> α ;     </m:t>
+          <m:t xml:space="preserve"> α</m:t>
+        </m:r>
+      </m:oMath>
+      <w:r>
+        <w:rPr>
+          <w:rFonts w:ascii="Times New Roman" w:hAnsi="Times New Roman" w:eastAsia="Times New Roman"/>
+          <w:b w:val="0"/>
+          <w:i w:val="0"/>
+          <w:sz w:val="26"/>
+        </w:rPr>
+        <w:tab/>
+        <w:t>(2-8)</w:t>
+      </w:r>
+    </w:p>
+    <w:p>
+      <w:pPr>
+        <w:spacing w:before="80" w:after="80" w:line="288" w:lineRule="auto"/>
+        <w:tabs>
+          <w:tab w:val="center" w:pos="4535"/>
+          <w:tab w:val="right" w:pos="9071"/>
+        </w:tabs>
+      </w:pPr>
+      <w:r>
+        <w:tab/>
+      </w:r>
+      <m:oMath>
+        <m:sSub>
+          <m:e>
+            <m:r>
+              <w:rPr>
+                <w:rFonts w:ascii="Cambria Math" w:hAnsi="Cambria Math"/>
+              </w:rPr>
+              <m:t xml:space="preserve">h</m:t>
+            </m:r>
+          </m:e>
+          <m:sub>
+            <m:r>
+              <w:rPr>
+                <w:rFonts w:ascii="Cambria Math" w:hAnsi="Cambria Math"/>
+              </w:rPr>
+              <m:t xml:space="preserve">sl1%</m:t>
+            </m:r>
+          </m:sub>
+        </m:sSub>
+        <m:r>
+          <w:rPr>
+            <w:rFonts w:ascii="Cambria Math" w:hAnsi="Cambria Math"/>
+          </w:rPr>
+          <m:t xml:space="preserve"> = </m:t>
         </m:r>
         <m:sSub>
           <m:e>
@@ -468,7 +516,7 @@
               <w:rPr>
                 <w:rFonts w:ascii="Cambria Math" w:hAnsi="Cambria Math"/>
               </w:rPr>
-              <m:t xml:space="preserve">w</m:t>
+              <m:t xml:space="preserve">r</m:t>
             </m:r>
           </m:sub>
         </m:sSub>
@@ -476,32 +524,189 @@
           <w:rPr>
             <w:rFonts w:ascii="Cambria Math" w:hAnsi="Cambria Math"/>
           </w:rPr>
-          <m:t xml:space="preserve"> = 3·</m:t>
+          <m:t xml:space="preserve">·</m:t>
         </m:r>
-        <m:sSup>
+        <m:sSub>
           <m:e>
             <m:r>
               <w:rPr>
                 <w:rFonts w:ascii="Cambria Math" w:hAnsi="Cambria Math"/>
               </w:rPr>
-              <m:t xml:space="preserve">10</m:t>
+              <m:t xml:space="preserve">k</m:t>
             </m:r>
           </m:e>
-          <m:sup>
+          <m:sub>
             <m:r>
               <w:rPr>
                 <w:rFonts w:ascii="Cambria Math" w:hAnsi="Cambria Math"/>
               </w:rPr>
-              <m:t xml:space="preserve">−7</m:t>
+              <m:t xml:space="preserve">p</m:t>
             </m:r>
-          </m:sup>
-        </m:sSup>
+          </m:sub>
+        </m:sSub>
         <m:r>
           <w:rPr>
             <w:rFonts w:ascii="Cambria Math" w:hAnsi="Cambria Math"/>
           </w:rPr>
-          <m:t xml:space="preserve">·(1 + 0,3·V)</m:t>
+          <m:t xml:space="preserve">·</m:t>
         </m:r>
+        <m:sSub>
+          <m:e>
+            <m:r>
+              <w:rPr>
+                <w:rFonts w:ascii="Cambria Math" w:hAnsi="Cambria Math"/>
+              </w:rPr>
+              <m:t xml:space="preserve">k</m:t>
+            </m:r>
+          </m:e>
+          <m:sub>
+            <m:r>
+              <w:rPr>
+                <w:rFonts w:ascii="Cambria Math" w:hAnsi="Cambria Math"/>
+              </w:rPr>
+              <m:t xml:space="preserve">sp</m:t>
+            </m:r>
+          </m:sub>
+        </m:sSub>
+        <m:r>
+          <w:rPr>
+            <w:rFonts w:ascii="Cambria Math" w:hAnsi="Cambria Math"/>
+          </w:rPr>
+          <m:t xml:space="preserve">·</m:t>
+        </m:r>
+        <m:sSub>
+          <m:e>
+            <m:r>
+              <w:rPr>
+                <w:rFonts w:ascii="Cambria Math" w:hAnsi="Cambria Math"/>
+              </w:rPr>
+              <m:t xml:space="preserve">k</m:t>
+            </m:r>
+          </m:e>
+          <m:sub>
+            <m:r>
+              <w:rPr>
+                <w:rFonts w:ascii="Cambria Math" w:hAnsi="Cambria Math"/>
+              </w:rPr>
+              <m:t xml:space="preserve">run</m:t>
+            </m:r>
+          </m:sub>
+        </m:sSub>
+        <m:r>
+          <w:rPr>
+            <w:rFonts w:ascii="Cambria Math" w:hAnsi="Cambria Math"/>
+          </w:rPr>
+          <m:t xml:space="preserve">·</m:t>
+        </m:r>
+        <m:sSub>
+          <m:e>
+            <m:r>
+              <w:rPr>
+                <w:rFonts w:ascii="Cambria Math" w:hAnsi="Cambria Math"/>
+              </w:rPr>
+              <m:t xml:space="preserve">k</m:t>
+            </m:r>
+          </m:e>
+          <m:sub>
+            <m:r>
+              <w:rPr>
+                <w:rFonts w:ascii="Cambria Math" w:hAnsi="Cambria Math"/>
+              </w:rPr>
+              <m:t xml:space="preserve">α</m:t>
+            </m:r>
+          </m:sub>
+        </m:sSub>
+        <m:r>
+          <w:rPr>
+            <w:rFonts w:ascii="Cambria Math" w:hAnsi="Cambria Math"/>
+          </w:rPr>
+          <m:t xml:space="preserve">·</m:t>
+        </m:r>
+        <m:sSub>
+          <m:e>
+            <m:r>
+              <w:rPr>
+                <w:rFonts w:ascii="Cambria Math" w:hAnsi="Cambria Math"/>
+              </w:rPr>
+              <m:t xml:space="preserve">h</m:t>
+            </m:r>
+          </m:e>
+          <m:sub>
+            <m:r>
+              <w:rPr>
+                <w:rFonts w:ascii="Cambria Math" w:hAnsi="Cambria Math"/>
+              </w:rPr>
+              <m:t xml:space="preserve">1%</m:t>
+            </m:r>
+          </m:sub>
+        </m:sSub>
+        <m:r>
+          <w:rPr>
+            <w:rFonts w:ascii="Cambria Math" w:hAnsi="Cambria Math"/>
+          </w:rPr>
+          <m:t xml:space="preserve"> ;     </m:t>
+        </m:r>
+        <m:sSub>
+          <m:e>
+            <m:r>
+              <w:rPr>
+                <w:rFonts w:ascii="Cambria Math" w:hAnsi="Cambria Math"/>
+              </w:rPr>
+              <m:t xml:space="preserve">h</m:t>
+            </m:r>
+          </m:e>
+          <m:sub>
+            <m:r>
+              <w:rPr>
+                <w:rFonts w:ascii="Cambria Math" w:hAnsi="Cambria Math"/>
+              </w:rPr>
+              <m:t xml:space="preserve">1%</m:t>
+            </m:r>
+          </m:sub>
+        </m:sSub>
+        <m:r>
+          <w:rPr>
+            <w:rFonts w:ascii="Cambria Math" w:hAnsi="Cambria Math"/>
+          </w:rPr>
+          <m:t xml:space="preserve"> = </m:t>
+        </m:r>
+        <m:sSub>
+          <m:e>
+            <m:r>
+              <w:rPr>
+                <w:rFonts w:ascii="Cambria Math" w:hAnsi="Cambria Math"/>
+              </w:rPr>
+              <m:t xml:space="preserve">K</m:t>
+            </m:r>
+          </m:e>
+          <m:sub>
+            <m:r>
+              <w:rPr>
+                <w:rFonts w:ascii="Cambria Math" w:hAnsi="Cambria Math"/>
+              </w:rPr>
+              <m:t xml:space="preserve">1%</m:t>
+            </m:r>
+          </m:sub>
+        </m:sSub>
+        <m:r>
+          <w:rPr>
+            <w:rFonts w:ascii="Cambria Math" w:hAnsi="Cambria Math"/>
+          </w:rPr>
+          <m:t xml:space="preserve">·</m:t>
+        </m:r>
+        <m:bar>
+          <m:barPr>
+            <m:pos m:val="top"/>
+          </m:barPr>
+          <m:e>
+            <m:r>
+              <w:rPr>
+                <w:rFonts w:ascii="Cambria Math" w:hAnsi="Cambria Math"/>
+              </w:rPr>
+              <m:t xml:space="preserve">h</m:t>
+            </m:r>
+          </m:e>
+        </m:bar>
       </m:oMath>
       <w:r>
         <w:rPr>
@@ -511,7 +716,476 @@
           <w:sz w:val="26"/>
         </w:rPr>
         <w:tab/>
-        <w:t>(2-8)</w:t>
+        <w:t>(2-9)</w:t>
+      </w:r>
+    </w:p>
+    <w:p>
+      <w:pPr>
+        <w:spacing w:before="120" w:after="0" w:line="288" w:lineRule="auto"/>
+        <w:ind w:firstLine="567"/>
+        <w:jc w:val="both"/>
+      </w:pPr>
+      <w:r>
+        <w:rPr>
+          <w:rFonts w:ascii="Times New Roman" w:hAnsi="Times New Roman" w:eastAsia="Times New Roman"/>
+          <w:b w:val="0"/>
+          <w:i w:val="0"/>
+          <w:sz w:val="26"/>
+        </w:rPr>
+        <w:t>Trong đó: V – vận tốc gió tính toán ở độ cao 10 m trên mặt nước, V = V</w:t>
+      </w:r>
+      <w:r>
+        <w:rPr>
+          <w:rFonts w:ascii="Times New Roman" w:hAnsi="Times New Roman" w:eastAsia="Times New Roman"/>
+          <w:b w:val="0"/>
+          <w:i w:val="0"/>
+          <w:sz w:val="26"/>
+          <w:vertAlign w:val="subscript"/>
+        </w:rPr>
+        <w:t>w</w:t>
+      </w:r>
+      <w:r>
+        <w:rPr>
+          <w:rFonts w:ascii="Times New Roman" w:hAnsi="Times New Roman" w:eastAsia="Times New Roman"/>
+          <w:b w:val="0"/>
+          <w:i w:val="0"/>
+          <w:sz w:val="26"/>
+        </w:rPr>
+        <w:t xml:space="preserve"> = k</w:t>
+      </w:r>
+      <w:r>
+        <w:rPr>
+          <w:rFonts w:ascii="Times New Roman" w:hAnsi="Times New Roman" w:eastAsia="Times New Roman"/>
+          <w:b w:val="0"/>
+          <w:i w:val="0"/>
+          <w:sz w:val="26"/>
+          <w:vertAlign w:val="subscript"/>
+        </w:rPr>
+        <w:t>fl</w:t>
+      </w:r>
+      <w:r>
+        <w:rPr>
+          <w:rFonts w:ascii="Times New Roman" w:hAnsi="Times New Roman" w:eastAsia="Times New Roman"/>
+          <w:b w:val="0"/>
+          <w:i w:val="0"/>
+          <w:sz w:val="26"/>
+        </w:rPr>
+        <w:t>·k</w:t>
+      </w:r>
+      <w:r>
+        <w:rPr>
+          <w:rFonts w:ascii="Times New Roman" w:hAnsi="Times New Roman" w:eastAsia="Times New Roman"/>
+          <w:b w:val="0"/>
+          <w:i w:val="0"/>
+          <w:sz w:val="26"/>
+          <w:vertAlign w:val="subscript"/>
+        </w:rPr>
+        <w:t>l</w:t>
+      </w:r>
+      <w:r>
+        <w:rPr>
+          <w:rFonts w:ascii="Times New Roman" w:hAnsi="Times New Roman" w:eastAsia="Times New Roman"/>
+          <w:b w:val="0"/>
+          <w:i w:val="0"/>
+          <w:sz w:val="26"/>
+        </w:rPr>
+        <w:t>·V</w:t>
+      </w:r>
+      <w:r>
+        <w:rPr>
+          <w:rFonts w:ascii="Times New Roman" w:hAnsi="Times New Roman" w:eastAsia="Times New Roman"/>
+          <w:b w:val="0"/>
+          <w:i w:val="0"/>
+          <w:sz w:val="26"/>
+          <w:vertAlign w:val="subscript"/>
+        </w:rPr>
+        <w:t>l</w:t>
+      </w:r>
+      <w:r>
+        <w:rPr>
+          <w:rFonts w:ascii="Times New Roman" w:hAnsi="Times New Roman" w:eastAsia="Times New Roman"/>
+          <w:b w:val="0"/>
+          <w:i w:val="0"/>
+          <w:sz w:val="26"/>
+        </w:rPr>
+        <w:t xml:space="preserve"> (TCVN 8421:2010, Phụ lục A, A.3.3), với V</w:t>
+      </w:r>
+      <w:r>
+        <w:rPr>
+          <w:rFonts w:ascii="Times New Roman" w:hAnsi="Times New Roman" w:eastAsia="Times New Roman"/>
+          <w:b w:val="0"/>
+          <w:i w:val="0"/>
+          <w:sz w:val="26"/>
+          <w:vertAlign w:val="subscript"/>
+        </w:rPr>
+        <w:t>l</w:t>
+      </w:r>
+      <w:r>
+        <w:rPr>
+          <w:rFonts w:ascii="Times New Roman" w:hAnsi="Times New Roman" w:eastAsia="Times New Roman"/>
+          <w:b w:val="0"/>
+          <w:i w:val="0"/>
+          <w:sz w:val="26"/>
+        </w:rPr>
+        <w:t xml:space="preserve"> – vận tốc gió quan trắc ở trạm Phan Thiết (Bảng 1.4), k</w:t>
+      </w:r>
+      <w:r>
+        <w:rPr>
+          <w:rFonts w:ascii="Times New Roman" w:hAnsi="Times New Roman" w:eastAsia="Times New Roman"/>
+          <w:b w:val="0"/>
+          <w:i w:val="0"/>
+          <w:sz w:val="26"/>
+          <w:vertAlign w:val="subscript"/>
+        </w:rPr>
+        <w:t>l</w:t>
+      </w:r>
+      <w:r>
+        <w:rPr>
+          <w:rFonts w:ascii="Times New Roman" w:hAnsi="Times New Roman" w:eastAsia="Times New Roman"/>
+          <w:b w:val="0"/>
+          <w:i w:val="0"/>
+          <w:sz w:val="26"/>
+        </w:rPr>
+        <w:t xml:space="preserve"> = 1,10 ÷ 1,09 – hệ số quy đổi về mặt nước cho địa hình dạng A (vùng ven biển trống trải, Bảng A3), k</w:t>
+      </w:r>
+      <w:r>
+        <w:rPr>
+          <w:rFonts w:ascii="Times New Roman" w:hAnsi="Times New Roman" w:eastAsia="Times New Roman"/>
+          <w:b w:val="0"/>
+          <w:i w:val="0"/>
+          <w:sz w:val="26"/>
+          <w:vertAlign w:val="subscript"/>
+        </w:rPr>
+        <w:t>fl</w:t>
+      </w:r>
+      <w:r>
+        <w:rPr>
+          <w:rFonts w:ascii="Times New Roman" w:hAnsi="Times New Roman" w:eastAsia="Times New Roman"/>
+          <w:b w:val="0"/>
+          <w:i w:val="0"/>
+          <w:sz w:val="26"/>
+        </w:rPr>
+        <w:t xml:space="preserve"> – hệ số quy đổi số liệu phong tiêu, lấy bằng 1 (thiên an toàn); D – đà gió (m); H – chiều sâu nước trước đập (m); α – góc giữa hướng gió và pháp tuyến mái thượng lưu; k</w:t>
+      </w:r>
+      <w:r>
+        <w:rPr>
+          <w:rFonts w:ascii="Times New Roman" w:hAnsi="Times New Roman" w:eastAsia="Times New Roman"/>
+          <w:b w:val="0"/>
+          <w:i w:val="0"/>
+          <w:sz w:val="26"/>
+          <w:vertAlign w:val="subscript"/>
+        </w:rPr>
+        <w:t>w</w:t>
+      </w:r>
+      <w:r>
+        <w:rPr>
+          <w:rFonts w:ascii="Times New Roman" w:hAnsi="Times New Roman" w:eastAsia="Times New Roman"/>
+          <w:b w:val="0"/>
+          <w:i w:val="0"/>
+          <w:sz w:val="26"/>
+        </w:rPr>
+        <w:t xml:space="preserve"> – hệ số tra Bảng A2 theo vận tốc gió (V = 20; 30; 40; 50 m/s: k</w:t>
+      </w:r>
+      <w:r>
+        <w:rPr>
+          <w:rFonts w:ascii="Times New Roman" w:hAnsi="Times New Roman" w:eastAsia="Times New Roman"/>
+          <w:b w:val="0"/>
+          <w:i w:val="0"/>
+          <w:sz w:val="26"/>
+          <w:vertAlign w:val="subscript"/>
+        </w:rPr>
+        <w:t>w</w:t>
+      </w:r>
+      <w:r>
+        <w:rPr>
+          <w:rFonts w:ascii="Times New Roman" w:hAnsi="Times New Roman" w:eastAsia="Times New Roman"/>
+          <w:b w:val="0"/>
+          <w:i w:val="0"/>
+          <w:sz w:val="26"/>
+        </w:rPr>
+        <w:t xml:space="preserve"> = 2,1; 3,0; 3,9; 4,8·10</w:t>
+      </w:r>
+      <w:r>
+        <w:rPr>
+          <w:rFonts w:ascii="Times New Roman" w:hAnsi="Times New Roman" w:eastAsia="Times New Roman"/>
+          <w:b w:val="0"/>
+          <w:i w:val="0"/>
+          <w:sz w:val="26"/>
+          <w:vertAlign w:val="superscript"/>
+        </w:rPr>
+        <w:t>-6</w:t>
+      </w:r>
+      <w:r>
+        <w:rPr>
+          <w:rFonts w:ascii="Times New Roman" w:hAnsi="Times New Roman" w:eastAsia="Times New Roman"/>
+          <w:b w:val="0"/>
+          <w:i w:val="0"/>
+          <w:sz w:val="26"/>
+        </w:rPr>
+        <w:t>; bảng không có giá trị khi V &lt; 20 m/s nên lấy 2,1·10</w:t>
+      </w:r>
+      <w:r>
+        <w:rPr>
+          <w:rFonts w:ascii="Times New Roman" w:hAnsi="Times New Roman" w:eastAsia="Times New Roman"/>
+          <w:b w:val="0"/>
+          <w:i w:val="0"/>
+          <w:sz w:val="26"/>
+          <w:vertAlign w:val="superscript"/>
+        </w:rPr>
+        <w:t>-6</w:t>
+      </w:r>
+      <w:r>
+        <w:rPr>
+          <w:rFonts w:ascii="Times New Roman" w:hAnsi="Times New Roman" w:eastAsia="Times New Roman"/>
+          <w:b w:val="0"/>
+          <w:i w:val="0"/>
+          <w:sz w:val="26"/>
+        </w:rPr>
+        <w:t>); h̄ – chiều cao sóng trung bình; K</w:t>
+      </w:r>
+      <w:r>
+        <w:rPr>
+          <w:rFonts w:ascii="Times New Roman" w:hAnsi="Times New Roman" w:eastAsia="Times New Roman"/>
+          <w:b w:val="0"/>
+          <w:i w:val="0"/>
+          <w:sz w:val="26"/>
+          <w:vertAlign w:val="subscript"/>
+        </w:rPr>
+        <w:t>1%</w:t>
+      </w:r>
+      <w:r>
+        <w:rPr>
+          <w:rFonts w:ascii="Times New Roman" w:hAnsi="Times New Roman" w:eastAsia="Times New Roman"/>
+          <w:b w:val="0"/>
+          <w:i w:val="0"/>
+          <w:sz w:val="26"/>
+        </w:rPr>
+        <w:t xml:space="preserve"> – hệ số theo gD/V</w:t>
+      </w:r>
+      <w:r>
+        <w:rPr>
+          <w:rFonts w:ascii="Times New Roman" w:hAnsi="Times New Roman" w:eastAsia="Times New Roman"/>
+          <w:b w:val="0"/>
+          <w:i w:val="0"/>
+          <w:sz w:val="26"/>
+          <w:vertAlign w:val="superscript"/>
+        </w:rPr>
+        <w:t>2</w:t>
+      </w:r>
+      <w:r>
+        <w:rPr>
+          <w:rFonts w:ascii="Times New Roman" w:hAnsi="Times New Roman" w:eastAsia="Times New Roman"/>
+          <w:b w:val="0"/>
+          <w:i w:val="0"/>
+          <w:sz w:val="26"/>
+        </w:rPr>
+        <w:t xml:space="preserve"> (Hình 2 của tiêu chuẩn); k</w:t>
+      </w:r>
+      <w:r>
+        <w:rPr>
+          <w:rFonts w:ascii="Times New Roman" w:hAnsi="Times New Roman" w:eastAsia="Times New Roman"/>
+          <w:b w:val="0"/>
+          <w:i w:val="0"/>
+          <w:sz w:val="26"/>
+          <w:vertAlign w:val="subscript"/>
+        </w:rPr>
+        <w:t>r</w:t>
+      </w:r>
+      <w:r>
+        <w:rPr>
+          <w:rFonts w:ascii="Times New Roman" w:hAnsi="Times New Roman" w:eastAsia="Times New Roman"/>
+          <w:b w:val="0"/>
+          <w:i w:val="0"/>
+          <w:sz w:val="26"/>
+        </w:rPr>
+        <w:t>, k</w:t>
+      </w:r>
+      <w:r>
+        <w:rPr>
+          <w:rFonts w:ascii="Times New Roman" w:hAnsi="Times New Roman" w:eastAsia="Times New Roman"/>
+          <w:b w:val="0"/>
+          <w:i w:val="0"/>
+          <w:sz w:val="26"/>
+          <w:vertAlign w:val="subscript"/>
+        </w:rPr>
+        <w:t>p</w:t>
+      </w:r>
+      <w:r>
+        <w:rPr>
+          <w:rFonts w:ascii="Times New Roman" w:hAnsi="Times New Roman" w:eastAsia="Times New Roman"/>
+          <w:b w:val="0"/>
+          <w:i w:val="0"/>
+          <w:sz w:val="26"/>
+        </w:rPr>
+        <w:t xml:space="preserve"> – hệ số nhám và thấm của lớp gia cố mái theo độ nhám tương đối Δ/h</w:t>
+      </w:r>
+      <w:r>
+        <w:rPr>
+          <w:rFonts w:ascii="Times New Roman" w:hAnsi="Times New Roman" w:eastAsia="Times New Roman"/>
+          <w:b w:val="0"/>
+          <w:i w:val="0"/>
+          <w:sz w:val="26"/>
+          <w:vertAlign w:val="subscript"/>
+        </w:rPr>
+        <w:t>1%</w:t>
+      </w:r>
+      <w:r>
+        <w:rPr>
+          <w:rFonts w:ascii="Times New Roman" w:hAnsi="Times New Roman" w:eastAsia="Times New Roman"/>
+          <w:b w:val="0"/>
+          <w:i w:val="0"/>
+          <w:sz w:val="26"/>
+        </w:rPr>
+        <w:t xml:space="preserve"> (mái gia cố đá xây, Δ = 0,02 m); k</w:t>
+      </w:r>
+      <w:r>
+        <w:rPr>
+          <w:rFonts w:ascii="Times New Roman" w:hAnsi="Times New Roman" w:eastAsia="Times New Roman"/>
+          <w:b w:val="0"/>
+          <w:i w:val="0"/>
+          <w:sz w:val="26"/>
+          <w:vertAlign w:val="subscript"/>
+        </w:rPr>
+        <w:t>sp</w:t>
+      </w:r>
+      <w:r>
+        <w:rPr>
+          <w:rFonts w:ascii="Times New Roman" w:hAnsi="Times New Roman" w:eastAsia="Times New Roman"/>
+          <w:b w:val="0"/>
+          <w:i w:val="0"/>
+          <w:sz w:val="26"/>
+        </w:rPr>
+        <w:t xml:space="preserve"> – hệ số theo vận tốc gió và hệ số mái (m = 3); k</w:t>
+      </w:r>
+      <w:r>
+        <w:rPr>
+          <w:rFonts w:ascii="Times New Roman" w:hAnsi="Times New Roman" w:eastAsia="Times New Roman"/>
+          <w:b w:val="0"/>
+          <w:i w:val="0"/>
+          <w:sz w:val="26"/>
+          <w:vertAlign w:val="subscript"/>
+        </w:rPr>
+        <w:t>run</w:t>
+      </w:r>
+      <w:r>
+        <w:rPr>
+          <w:rFonts w:ascii="Times New Roman" w:hAnsi="Times New Roman" w:eastAsia="Times New Roman"/>
+          <w:b w:val="0"/>
+          <w:i w:val="0"/>
+          <w:sz w:val="26"/>
+        </w:rPr>
+        <w:t xml:space="preserve"> – hệ số theo độ thoải sóng λ̄/h</w:t>
+      </w:r>
+      <w:r>
+        <w:rPr>
+          <w:rFonts w:ascii="Times New Roman" w:hAnsi="Times New Roman" w:eastAsia="Times New Roman"/>
+          <w:b w:val="0"/>
+          <w:i w:val="0"/>
+          <w:sz w:val="26"/>
+          <w:vertAlign w:val="subscript"/>
+        </w:rPr>
+        <w:t>1%</w:t>
+      </w:r>
+      <w:r>
+        <w:rPr>
+          <w:rFonts w:ascii="Times New Roman" w:hAnsi="Times New Roman" w:eastAsia="Times New Roman"/>
+          <w:b w:val="0"/>
+          <w:i w:val="0"/>
+          <w:sz w:val="26"/>
+        </w:rPr>
+        <w:t xml:space="preserve"> (Hình 10); k</w:t>
+      </w:r>
+      <w:r>
+        <w:rPr>
+          <w:rFonts w:ascii="Times New Roman" w:hAnsi="Times New Roman" w:eastAsia="Times New Roman"/>
+          <w:b w:val="0"/>
+          <w:i w:val="0"/>
+          <w:sz w:val="26"/>
+          <w:vertAlign w:val="subscript"/>
+        </w:rPr>
+        <w:t>α</w:t>
+      </w:r>
+      <w:r>
+        <w:rPr>
+          <w:rFonts w:ascii="Times New Roman" w:hAnsi="Times New Roman" w:eastAsia="Times New Roman"/>
+          <w:b w:val="0"/>
+          <w:i w:val="0"/>
+          <w:sz w:val="26"/>
+        </w:rPr>
+        <w:t xml:space="preserve"> – hệ số giảm sóng leo theo góc α (Bảng 9: 0° – 1,00; 20° – 0,96; 40° – 0,87; 60° – 0,76).</w:t>
+      </w:r>
+    </w:p>
+    <w:p>
+      <w:pPr>
+        <w:spacing w:before="120" w:after="0" w:line="288" w:lineRule="auto"/>
+        <w:ind w:firstLine="567"/>
+        <w:jc w:val="both"/>
+      </w:pPr>
+      <w:r>
+        <w:rPr>
+          <w:rFonts w:ascii="Times New Roman" w:hAnsi="Times New Roman" w:eastAsia="Times New Roman"/>
+          <w:b w:val="0"/>
+          <w:i w:val="0"/>
+          <w:sz w:val="26"/>
+        </w:rPr>
+        <w:t>Chiều cao h̄ và chu kỳ τ̄ của sóng trung bình ở vùng nước sâu (H &gt; 0,5λ̄, bước sóng λ̄ = g·τ̄</w:t>
+      </w:r>
+      <w:r>
+        <w:rPr>
+          <w:rFonts w:ascii="Times New Roman" w:hAnsi="Times New Roman" w:eastAsia="Times New Roman"/>
+          <w:b w:val="0"/>
+          <w:i w:val="0"/>
+          <w:sz w:val="26"/>
+          <w:vertAlign w:val="superscript"/>
+        </w:rPr>
+        <w:t>2</w:t>
+      </w:r>
+      <w:r>
+        <w:rPr>
+          <w:rFonts w:ascii="Times New Roman" w:hAnsi="Times New Roman" w:eastAsia="Times New Roman"/>
+          <w:b w:val="0"/>
+          <w:i w:val="0"/>
+          <w:sz w:val="26"/>
+        </w:rPr>
+        <w:t>/(2π)) được tiêu chuẩn cho bằng đồ thị (đường bao trên, Hình 1) theo gD/V</w:t>
+      </w:r>
+      <w:r>
+        <w:rPr>
+          <w:rFonts w:ascii="Times New Roman" w:hAnsi="Times New Roman" w:eastAsia="Times New Roman"/>
+          <w:b w:val="0"/>
+          <w:i w:val="0"/>
+          <w:sz w:val="26"/>
+          <w:vertAlign w:val="superscript"/>
+        </w:rPr>
+        <w:t>2</w:t>
+      </w:r>
+      <w:r>
+        <w:rPr>
+          <w:rFonts w:ascii="Times New Roman" w:hAnsi="Times New Roman" w:eastAsia="Times New Roman"/>
+          <w:b w:val="0"/>
+          <w:i w:val="0"/>
+          <w:sz w:val="26"/>
+        </w:rPr>
+        <w:t xml:space="preserve"> – điều kiện đà gió và gt/V – điều kiện thời gian gió thổi t, lấy giá trị nhỏ hơn. Với t = 6 giờ, gt/V = 10.425 ÷ 25.346: sóng gần phát triển hoàn toàn, đồ thị cho giá trị lớn hơn nhiều so với điều kiện đà gió (gD/V</w:t>
+      </w:r>
+      <w:r>
+        <w:rPr>
+          <w:rFonts w:ascii="Times New Roman" w:hAnsi="Times New Roman" w:eastAsia="Times New Roman"/>
+          <w:b w:val="0"/>
+          <w:i w:val="0"/>
+          <w:sz w:val="26"/>
+          <w:vertAlign w:val="superscript"/>
+        </w:rPr>
+        <w:t>2</w:t>
+      </w:r>
+      <w:r>
+        <w:rPr>
+          <w:rFonts w:ascii="Times New Roman" w:hAnsi="Times New Roman" w:eastAsia="Times New Roman"/>
+          <w:b w:val="0"/>
+          <w:i w:val="0"/>
+          <w:sz w:val="26"/>
+        </w:rPr>
+        <w:t xml:space="preserve"> = 71 ÷ 425) nên đà gió quyết định. Đường bao theo đà gió được tính bằng công thức xấp xỉ của Krưlốp:</w:t>
       </w:r>
     </w:p>
     <w:p>
@@ -768,599 +1442,7 @@
           <w:sz w:val="26"/>
         </w:rPr>
         <w:tab/>
-        <w:t>(2-9)</w:t>
-      </w:r>
-    </w:p>
-    <w:p>
-      <w:pPr>
-        <w:spacing w:before="80" w:after="80" w:line="288" w:lineRule="auto"/>
-        <w:tabs>
-          <w:tab w:val="center" w:pos="4535"/>
-          <w:tab w:val="right" w:pos="9071"/>
-        </w:tabs>
-      </w:pPr>
-      <w:r>
-        <w:tab/>
-      </w:r>
-      <m:oMath>
-        <m:sSub>
-          <m:e>
-            <m:r>
-              <w:rPr>
-                <w:rFonts w:ascii="Cambria Math" w:hAnsi="Cambria Math"/>
-              </w:rPr>
-              <m:t xml:space="preserve">h</m:t>
-            </m:r>
-          </m:e>
-          <m:sub>
-            <m:r>
-              <w:rPr>
-                <w:rFonts w:ascii="Cambria Math" w:hAnsi="Cambria Math"/>
-              </w:rPr>
-              <m:t xml:space="preserve">sl1%</m:t>
-            </m:r>
-          </m:sub>
-        </m:sSub>
-        <m:r>
-          <w:rPr>
-            <w:rFonts w:ascii="Cambria Math" w:hAnsi="Cambria Math"/>
-          </w:rPr>
-          <m:t xml:space="preserve"> = </m:t>
-        </m:r>
-        <m:sSub>
-          <m:e>
-            <m:r>
-              <w:rPr>
-                <w:rFonts w:ascii="Cambria Math" w:hAnsi="Cambria Math"/>
-              </w:rPr>
-              <m:t xml:space="preserve">k</m:t>
-            </m:r>
-          </m:e>
-          <m:sub>
-            <m:r>
-              <w:rPr>
-                <w:rFonts w:ascii="Cambria Math" w:hAnsi="Cambria Math"/>
-              </w:rPr>
-              <m:t xml:space="preserve">r</m:t>
-            </m:r>
-          </m:sub>
-        </m:sSub>
-        <m:r>
-          <w:rPr>
-            <w:rFonts w:ascii="Cambria Math" w:hAnsi="Cambria Math"/>
-          </w:rPr>
-          <m:t xml:space="preserve">·</m:t>
-        </m:r>
-        <m:sSub>
-          <m:e>
-            <m:r>
-              <w:rPr>
-                <w:rFonts w:ascii="Cambria Math" w:hAnsi="Cambria Math"/>
-              </w:rPr>
-              <m:t xml:space="preserve">k</m:t>
-            </m:r>
-          </m:e>
-          <m:sub>
-            <m:r>
-              <w:rPr>
-                <w:rFonts w:ascii="Cambria Math" w:hAnsi="Cambria Math"/>
-              </w:rPr>
-              <m:t xml:space="preserve">p</m:t>
-            </m:r>
-          </m:sub>
-        </m:sSub>
-        <m:r>
-          <w:rPr>
-            <w:rFonts w:ascii="Cambria Math" w:hAnsi="Cambria Math"/>
-          </w:rPr>
-          <m:t xml:space="preserve">·</m:t>
-        </m:r>
-        <m:sSub>
-          <m:e>
-            <m:r>
-              <w:rPr>
-                <w:rFonts w:ascii="Cambria Math" w:hAnsi="Cambria Math"/>
-              </w:rPr>
-              <m:t xml:space="preserve">k</m:t>
-            </m:r>
-          </m:e>
-          <m:sub>
-            <m:r>
-              <w:rPr>
-                <w:rFonts w:ascii="Cambria Math" w:hAnsi="Cambria Math"/>
-              </w:rPr>
-              <m:t xml:space="preserve">sp</m:t>
-            </m:r>
-          </m:sub>
-        </m:sSub>
-        <m:r>
-          <w:rPr>
-            <w:rFonts w:ascii="Cambria Math" w:hAnsi="Cambria Math"/>
-          </w:rPr>
-          <m:t xml:space="preserve">·</m:t>
-        </m:r>
-        <m:sSub>
-          <m:e>
-            <m:r>
-              <w:rPr>
-                <w:rFonts w:ascii="Cambria Math" w:hAnsi="Cambria Math"/>
-              </w:rPr>
-              <m:t xml:space="preserve">k</m:t>
-            </m:r>
-          </m:e>
-          <m:sub>
-            <m:r>
-              <w:rPr>
-                <w:rFonts w:ascii="Cambria Math" w:hAnsi="Cambria Math"/>
-              </w:rPr>
-              <m:t xml:space="preserve">run</m:t>
-            </m:r>
-          </m:sub>
-        </m:sSub>
-        <m:r>
-          <w:rPr>
-            <w:rFonts w:ascii="Cambria Math" w:hAnsi="Cambria Math"/>
-          </w:rPr>
-          <m:t xml:space="preserve">·</m:t>
-        </m:r>
-        <m:sSub>
-          <m:e>
-            <m:r>
-              <w:rPr>
-                <w:rFonts w:ascii="Cambria Math" w:hAnsi="Cambria Math"/>
-              </w:rPr>
-              <m:t xml:space="preserve">k</m:t>
-            </m:r>
-          </m:e>
-          <m:sub>
-            <m:r>
-              <w:rPr>
-                <w:rFonts w:ascii="Cambria Math" w:hAnsi="Cambria Math"/>
-              </w:rPr>
-              <m:t xml:space="preserve">α</m:t>
-            </m:r>
-          </m:sub>
-        </m:sSub>
-        <m:r>
-          <w:rPr>
-            <w:rFonts w:ascii="Cambria Math" w:hAnsi="Cambria Math"/>
-          </w:rPr>
-          <m:t xml:space="preserve">·</m:t>
-        </m:r>
-        <m:sSub>
-          <m:e>
-            <m:r>
-              <w:rPr>
-                <w:rFonts w:ascii="Cambria Math" w:hAnsi="Cambria Math"/>
-              </w:rPr>
-              <m:t xml:space="preserve">h</m:t>
-            </m:r>
-          </m:e>
-          <m:sub>
-            <m:r>
-              <w:rPr>
-                <w:rFonts w:ascii="Cambria Math" w:hAnsi="Cambria Math"/>
-              </w:rPr>
-              <m:t xml:space="preserve">1%</m:t>
-            </m:r>
-          </m:sub>
-        </m:sSub>
-        <m:r>
-          <w:rPr>
-            <w:rFonts w:ascii="Cambria Math" w:hAnsi="Cambria Math"/>
-          </w:rPr>
-          <m:t xml:space="preserve"> ;     </m:t>
-        </m:r>
-        <m:sSub>
-          <m:e>
-            <m:r>
-              <w:rPr>
-                <w:rFonts w:ascii="Cambria Math" w:hAnsi="Cambria Math"/>
-              </w:rPr>
-              <m:t xml:space="preserve">h</m:t>
-            </m:r>
-          </m:e>
-          <m:sub>
-            <m:r>
-              <w:rPr>
-                <w:rFonts w:ascii="Cambria Math" w:hAnsi="Cambria Math"/>
-              </w:rPr>
-              <m:t xml:space="preserve">1%</m:t>
-            </m:r>
-          </m:sub>
-        </m:sSub>
-        <m:r>
-          <w:rPr>
-            <w:rFonts w:ascii="Cambria Math" w:hAnsi="Cambria Math"/>
-          </w:rPr>
-          <m:t xml:space="preserve"> = </m:t>
-        </m:r>
-        <m:sSub>
-          <m:e>
-            <m:r>
-              <w:rPr>
-                <w:rFonts w:ascii="Cambria Math" w:hAnsi="Cambria Math"/>
-              </w:rPr>
-              <m:t xml:space="preserve">K</m:t>
-            </m:r>
-          </m:e>
-          <m:sub>
-            <m:r>
-              <w:rPr>
-                <w:rFonts w:ascii="Cambria Math" w:hAnsi="Cambria Math"/>
-              </w:rPr>
-              <m:t xml:space="preserve">1%</m:t>
-            </m:r>
-          </m:sub>
-        </m:sSub>
-        <m:r>
-          <w:rPr>
-            <w:rFonts w:ascii="Cambria Math" w:hAnsi="Cambria Math"/>
-          </w:rPr>
-          <m:t xml:space="preserve">·</m:t>
-        </m:r>
-        <m:bar>
-          <m:barPr>
-            <m:pos m:val="top"/>
-          </m:barPr>
-          <m:e>
-            <m:r>
-              <w:rPr>
-                <w:rFonts w:ascii="Cambria Math" w:hAnsi="Cambria Math"/>
-              </w:rPr>
-              <m:t xml:space="preserve">h</m:t>
-            </m:r>
-          </m:e>
-        </m:bar>
-      </m:oMath>
-      <w:r>
-        <w:rPr>
-          <w:rFonts w:ascii="Times New Roman" w:hAnsi="Times New Roman" w:eastAsia="Times New Roman"/>
-          <w:b w:val="0"/>
-          <w:i w:val="0"/>
-          <w:sz w:val="26"/>
-        </w:rPr>
-        <w:tab/>
         <w:t>(2-10)</w:t>
-      </w:r>
-    </w:p>
-    <w:p>
-      <w:pPr>
-        <w:spacing w:before="120" w:after="0" w:line="288" w:lineRule="auto"/>
-        <w:ind w:firstLine="567"/>
-        <w:jc w:val="both"/>
-      </w:pPr>
-      <w:r>
-        <w:rPr>
-          <w:rFonts w:ascii="Times New Roman" w:hAnsi="Times New Roman" w:eastAsia="Times New Roman"/>
-          <w:b w:val="0"/>
-          <w:i w:val="0"/>
-          <w:sz w:val="26"/>
-        </w:rPr>
-        <w:t>Trong đó: V – vận tốc gió tính toán ở độ cao 10 m trên mặt nước, V = V</w:t>
-      </w:r>
-      <w:r>
-        <w:rPr>
-          <w:rFonts w:ascii="Times New Roman" w:hAnsi="Times New Roman" w:eastAsia="Times New Roman"/>
-          <w:b w:val="0"/>
-          <w:i w:val="0"/>
-          <w:sz w:val="26"/>
-          <w:vertAlign w:val="subscript"/>
-        </w:rPr>
-        <w:t>w</w:t>
-      </w:r>
-      <w:r>
-        <w:rPr>
-          <w:rFonts w:ascii="Times New Roman" w:hAnsi="Times New Roman" w:eastAsia="Times New Roman"/>
-          <w:b w:val="0"/>
-          <w:i w:val="0"/>
-          <w:sz w:val="26"/>
-        </w:rPr>
-        <w:t xml:space="preserve"> = k</w:t>
-      </w:r>
-      <w:r>
-        <w:rPr>
-          <w:rFonts w:ascii="Times New Roman" w:hAnsi="Times New Roman" w:eastAsia="Times New Roman"/>
-          <w:b w:val="0"/>
-          <w:i w:val="0"/>
-          <w:sz w:val="26"/>
-          <w:vertAlign w:val="subscript"/>
-        </w:rPr>
-        <w:t>fl</w:t>
-      </w:r>
-      <w:r>
-        <w:rPr>
-          <w:rFonts w:ascii="Times New Roman" w:hAnsi="Times New Roman" w:eastAsia="Times New Roman"/>
-          <w:b w:val="0"/>
-          <w:i w:val="0"/>
-          <w:sz w:val="26"/>
-        </w:rPr>
-        <w:t>·k</w:t>
-      </w:r>
-      <w:r>
-        <w:rPr>
-          <w:rFonts w:ascii="Times New Roman" w:hAnsi="Times New Roman" w:eastAsia="Times New Roman"/>
-          <w:b w:val="0"/>
-          <w:i w:val="0"/>
-          <w:sz w:val="26"/>
-          <w:vertAlign w:val="subscript"/>
-        </w:rPr>
-        <w:t>l</w:t>
-      </w:r>
-      <w:r>
-        <w:rPr>
-          <w:rFonts w:ascii="Times New Roman" w:hAnsi="Times New Roman" w:eastAsia="Times New Roman"/>
-          <w:b w:val="0"/>
-          <w:i w:val="0"/>
-          <w:sz w:val="26"/>
-        </w:rPr>
-        <w:t>·V</w:t>
-      </w:r>
-      <w:r>
-        <w:rPr>
-          <w:rFonts w:ascii="Times New Roman" w:hAnsi="Times New Roman" w:eastAsia="Times New Roman"/>
-          <w:b w:val="0"/>
-          <w:i w:val="0"/>
-          <w:sz w:val="26"/>
-          <w:vertAlign w:val="subscript"/>
-        </w:rPr>
-        <w:t>l</w:t>
-      </w:r>
-      <w:r>
-        <w:rPr>
-          <w:rFonts w:ascii="Times New Roman" w:hAnsi="Times New Roman" w:eastAsia="Times New Roman"/>
-          <w:b w:val="0"/>
-          <w:i w:val="0"/>
-          <w:sz w:val="26"/>
-        </w:rPr>
-        <w:t xml:space="preserve"> (TCVN 8421:2010, Phụ lục A, A.3.3), với V</w:t>
-      </w:r>
-      <w:r>
-        <w:rPr>
-          <w:rFonts w:ascii="Times New Roman" w:hAnsi="Times New Roman" w:eastAsia="Times New Roman"/>
-          <w:b w:val="0"/>
-          <w:i w:val="0"/>
-          <w:sz w:val="26"/>
-          <w:vertAlign w:val="subscript"/>
-        </w:rPr>
-        <w:t>l</w:t>
-      </w:r>
-      <w:r>
-        <w:rPr>
-          <w:rFonts w:ascii="Times New Roman" w:hAnsi="Times New Roman" w:eastAsia="Times New Roman"/>
-          <w:b w:val="0"/>
-          <w:i w:val="0"/>
-          <w:sz w:val="26"/>
-        </w:rPr>
-        <w:t xml:space="preserve"> – vận tốc gió quan trắc ở trạm Phan Thiết (Bảng 1.4), k</w:t>
-      </w:r>
-      <w:r>
-        <w:rPr>
-          <w:rFonts w:ascii="Times New Roman" w:hAnsi="Times New Roman" w:eastAsia="Times New Roman"/>
-          <w:b w:val="0"/>
-          <w:i w:val="0"/>
-          <w:sz w:val="26"/>
-          <w:vertAlign w:val="subscript"/>
-        </w:rPr>
-        <w:t>l</w:t>
-      </w:r>
-      <w:r>
-        <w:rPr>
-          <w:rFonts w:ascii="Times New Roman" w:hAnsi="Times New Roman" w:eastAsia="Times New Roman"/>
-          <w:b w:val="0"/>
-          <w:i w:val="0"/>
-          <w:sz w:val="26"/>
-        </w:rPr>
-        <w:t xml:space="preserve"> = 1,10 ÷ 1,09 – hệ số quy đổi về mặt nước cho địa hình dạng A (vùng ven biển trống trải, Bảng A3), k</w:t>
-      </w:r>
-      <w:r>
-        <w:rPr>
-          <w:rFonts w:ascii="Times New Roman" w:hAnsi="Times New Roman" w:eastAsia="Times New Roman"/>
-          <w:b w:val="0"/>
-          <w:i w:val="0"/>
-          <w:sz w:val="26"/>
-          <w:vertAlign w:val="subscript"/>
-        </w:rPr>
-        <w:t>fl</w:t>
-      </w:r>
-      <w:r>
-        <w:rPr>
-          <w:rFonts w:ascii="Times New Roman" w:hAnsi="Times New Roman" w:eastAsia="Times New Roman"/>
-          <w:b w:val="0"/>
-          <w:i w:val="0"/>
-          <w:sz w:val="26"/>
-        </w:rPr>
-        <w:t xml:space="preserve"> – hệ số quy đổi số liệu phong tiêu, lấy bằng 1 (thiên an toàn); D – đà gió (m); H – chiều sâu nước trước đập (m); α – góc giữa hướng gió và pháp tuyến mái thượng lưu; h̄, τ̄ – chiều cao và chu kỳ sóng trung bình, sóng nước sâu khi H &gt; 0,5λ̄ với bước sóng λ̄ = g·τ̄</w:t>
-      </w:r>
-      <w:r>
-        <w:rPr>
-          <w:rFonts w:ascii="Times New Roman" w:hAnsi="Times New Roman" w:eastAsia="Times New Roman"/>
-          <w:b w:val="0"/>
-          <w:i w:val="0"/>
-          <w:sz w:val="26"/>
-          <w:vertAlign w:val="superscript"/>
-        </w:rPr>
-        <w:t>2</w:t>
-      </w:r>
-      <w:r>
-        <w:rPr>
-          <w:rFonts w:ascii="Times New Roman" w:hAnsi="Times New Roman" w:eastAsia="Times New Roman"/>
-          <w:b w:val="0"/>
-          <w:i w:val="0"/>
-          <w:sz w:val="26"/>
-        </w:rPr>
-        <w:t>/(2π), lấy giá trị nhỏ hơn giữa điều kiện đà gió và điều kiện thời gian gió thổi t = 6 giờ; K</w:t>
-      </w:r>
-      <w:r>
-        <w:rPr>
-          <w:rFonts w:ascii="Times New Roman" w:hAnsi="Times New Roman" w:eastAsia="Times New Roman"/>
-          <w:b w:val="0"/>
-          <w:i w:val="0"/>
-          <w:sz w:val="26"/>
-          <w:vertAlign w:val="subscript"/>
-        </w:rPr>
-        <w:t>1%</w:t>
-      </w:r>
-      <w:r>
-        <w:rPr>
-          <w:rFonts w:ascii="Times New Roman" w:hAnsi="Times New Roman" w:eastAsia="Times New Roman"/>
-          <w:b w:val="0"/>
-          <w:i w:val="0"/>
-          <w:sz w:val="26"/>
-        </w:rPr>
-        <w:t xml:space="preserve"> – hệ số theo gD/V</w:t>
-      </w:r>
-      <w:r>
-        <w:rPr>
-          <w:rFonts w:ascii="Times New Roman" w:hAnsi="Times New Roman" w:eastAsia="Times New Roman"/>
-          <w:b w:val="0"/>
-          <w:i w:val="0"/>
-          <w:sz w:val="26"/>
-          <w:vertAlign w:val="superscript"/>
-        </w:rPr>
-        <w:t>2</w:t>
-      </w:r>
-      <w:r>
-        <w:rPr>
-          <w:rFonts w:ascii="Times New Roman" w:hAnsi="Times New Roman" w:eastAsia="Times New Roman"/>
-          <w:b w:val="0"/>
-          <w:i w:val="0"/>
-          <w:sz w:val="26"/>
-        </w:rPr>
-        <w:t xml:space="preserve"> (Hình 2 của tiêu chuẩn); k</w:t>
-      </w:r>
-      <w:r>
-        <w:rPr>
-          <w:rFonts w:ascii="Times New Roman" w:hAnsi="Times New Roman" w:eastAsia="Times New Roman"/>
-          <w:b w:val="0"/>
-          <w:i w:val="0"/>
-          <w:sz w:val="26"/>
-          <w:vertAlign w:val="subscript"/>
-        </w:rPr>
-        <w:t>r</w:t>
-      </w:r>
-      <w:r>
-        <w:rPr>
-          <w:rFonts w:ascii="Times New Roman" w:hAnsi="Times New Roman" w:eastAsia="Times New Roman"/>
-          <w:b w:val="0"/>
-          <w:i w:val="0"/>
-          <w:sz w:val="26"/>
-        </w:rPr>
-        <w:t>, k</w:t>
-      </w:r>
-      <w:r>
-        <w:rPr>
-          <w:rFonts w:ascii="Times New Roman" w:hAnsi="Times New Roman" w:eastAsia="Times New Roman"/>
-          <w:b w:val="0"/>
-          <w:i w:val="0"/>
-          <w:sz w:val="26"/>
-          <w:vertAlign w:val="subscript"/>
-        </w:rPr>
-        <w:t>p</w:t>
-      </w:r>
-      <w:r>
-        <w:rPr>
-          <w:rFonts w:ascii="Times New Roman" w:hAnsi="Times New Roman" w:eastAsia="Times New Roman"/>
-          <w:b w:val="0"/>
-          <w:i w:val="0"/>
-          <w:sz w:val="26"/>
-        </w:rPr>
-        <w:t xml:space="preserve"> – hệ số nhám và thấm của lớp gia cố mái theo độ nhám tương đối Δ/h</w:t>
-      </w:r>
-      <w:r>
-        <w:rPr>
-          <w:rFonts w:ascii="Times New Roman" w:hAnsi="Times New Roman" w:eastAsia="Times New Roman"/>
-          <w:b w:val="0"/>
-          <w:i w:val="0"/>
-          <w:sz w:val="26"/>
-          <w:vertAlign w:val="subscript"/>
-        </w:rPr>
-        <w:t>1%</w:t>
-      </w:r>
-      <w:r>
-        <w:rPr>
-          <w:rFonts w:ascii="Times New Roman" w:hAnsi="Times New Roman" w:eastAsia="Times New Roman"/>
-          <w:b w:val="0"/>
-          <w:i w:val="0"/>
-          <w:sz w:val="26"/>
-        </w:rPr>
-        <w:t xml:space="preserve"> (mái gia cố đá xây, Δ = 0,02 m); k</w:t>
-      </w:r>
-      <w:r>
-        <w:rPr>
-          <w:rFonts w:ascii="Times New Roman" w:hAnsi="Times New Roman" w:eastAsia="Times New Roman"/>
-          <w:b w:val="0"/>
-          <w:i w:val="0"/>
-          <w:sz w:val="26"/>
-          <w:vertAlign w:val="subscript"/>
-        </w:rPr>
-        <w:t>sp</w:t>
-      </w:r>
-      <w:r>
-        <w:rPr>
-          <w:rFonts w:ascii="Times New Roman" w:hAnsi="Times New Roman" w:eastAsia="Times New Roman"/>
-          <w:b w:val="0"/>
-          <w:i w:val="0"/>
-          <w:sz w:val="26"/>
-        </w:rPr>
-        <w:t xml:space="preserve"> – hệ số theo vận tốc gió và hệ số mái (m = 3); k</w:t>
-      </w:r>
-      <w:r>
-        <w:rPr>
-          <w:rFonts w:ascii="Times New Roman" w:hAnsi="Times New Roman" w:eastAsia="Times New Roman"/>
-          <w:b w:val="0"/>
-          <w:i w:val="0"/>
-          <w:sz w:val="26"/>
-          <w:vertAlign w:val="subscript"/>
-        </w:rPr>
-        <w:t>run</w:t>
-      </w:r>
-      <w:r>
-        <w:rPr>
-          <w:rFonts w:ascii="Times New Roman" w:hAnsi="Times New Roman" w:eastAsia="Times New Roman"/>
-          <w:b w:val="0"/>
-          <w:i w:val="0"/>
-          <w:sz w:val="26"/>
-        </w:rPr>
-        <w:t xml:space="preserve"> – hệ số theo độ thoải sóng λ̄/h</w:t>
-      </w:r>
-      <w:r>
-        <w:rPr>
-          <w:rFonts w:ascii="Times New Roman" w:hAnsi="Times New Roman" w:eastAsia="Times New Roman"/>
-          <w:b w:val="0"/>
-          <w:i w:val="0"/>
-          <w:sz w:val="26"/>
-          <w:vertAlign w:val="subscript"/>
-        </w:rPr>
-        <w:t>1%</w:t>
-      </w:r>
-      <w:r>
-        <w:rPr>
-          <w:rFonts w:ascii="Times New Roman" w:hAnsi="Times New Roman" w:eastAsia="Times New Roman"/>
-          <w:b w:val="0"/>
-          <w:i w:val="0"/>
-          <w:sz w:val="26"/>
-        </w:rPr>
-        <w:t xml:space="preserve"> (Hình 10); k</w:t>
-      </w:r>
-      <w:r>
-        <w:rPr>
-          <w:rFonts w:ascii="Times New Roman" w:hAnsi="Times New Roman" w:eastAsia="Times New Roman"/>
-          <w:b w:val="0"/>
-          <w:i w:val="0"/>
-          <w:sz w:val="26"/>
-          <w:vertAlign w:val="subscript"/>
-        </w:rPr>
-        <w:t>α</w:t>
-      </w:r>
-      <w:r>
-        <w:rPr>
-          <w:rFonts w:ascii="Times New Roman" w:hAnsi="Times New Roman" w:eastAsia="Times New Roman"/>
-          <w:b w:val="0"/>
-          <w:i w:val="0"/>
-          <w:sz w:val="26"/>
-        </w:rPr>
-        <w:t xml:space="preserve"> – hệ số giảm sóng leo theo góc α (Bảng 9: 0° – 1,00; 20° – 0,96; 40° – 0,87; 60° – 0,76).</w:t>
       </w:r>
     </w:p>
     <w:p>
@@ -2788,7 +2870,7 @@
                 <w:i w:val="0"/>
                 <w:sz w:val="20"/>
               </w:rPr>
-              <w:t>0,007</w:t>
+              <w:t>0,009</w:t>
             </w:r>
           </w:p>
         </w:tc>
@@ -2809,7 +2891,7 @@
                 <w:i w:val="0"/>
                 <w:sz w:val="20"/>
               </w:rPr>
-              <w:t>0,001</w:t>
+              <w:t>0,002</w:t>
             </w:r>
           </w:p>
         </w:tc>
@@ -3873,7 +3955,7 @@
                 <w:i w:val="0"/>
                 <w:sz w:val="20"/>
               </w:rPr>
-              <w:t>76,74</w:t>
+              <w:t>76,75</w:t>
             </w:r>
           </w:p>
         </w:tc>

</xml_diff>

<commit_message>
Cao trình đỉnh đập: giải thích chiều sâu nước H (đáy lòng hồ +59,0) và hệ số mái m = 3,0 dùng tính sóng leo
H tính từ đáy lòng hồ +59,0 theo bình đồ 2022 (F = 0), không phải đáy đập +54,0 – thiên an toàn cho Δh (lấy +54,0 thì
Δh giảm 1 ÷ 3 mm). Mái thượng lưu m = 3,0 trên cơ +68,0, m = 3,5 dưới cơ: cơ nằm dưới MNDBT 6,70 m, MNLTK 9,43 m, sâu
hơn 0,5λ̄ = 2,9 ÷ 6,4 m nên sóng leo do đoạn m = 3,0 quyết định; Excel thêm dòng kiểm tra, Word thêm hai đoạn giải thích.

Co-Authored-By: Claude Opus 5.5 <noreply@anthropic.com>
Claude-Session: https://claude.ai/code/session_01FZ7RkEfpZxiJWB6royQwfj
</commit_message>
<xml_diff>
--- a/DATN_HoCaGiay/TAI_VE/Muc2.3_CaoTrinhDinhDap.docx
+++ b/DATN_HoCaGiay/TAI_VE/Muc2.3_CaoTrinhDinhDap.docx
@@ -1473,7 +1473,39 @@
           <w:i w:val="0"/>
           <w:sz w:val="26"/>
         </w:rPr>
-        <w:t>Mực nước tính toán: MNDBT = +74,70 m; MNLTK = +77,43 m và MNLKT = +78,39 m – kết quả điều tiết lũ khi các cửa van vận hành bình thường (mục 2.2.3). Tuyến đập có phương vị N96,2°E nên pháp tuyến mái thượng lưu hướng N6,2°E (lòng hồ ở phía Bắc). Sóng được tính cho các hướng gió thổi vào mái thượng lưu với góc tới không quá 60°: Bắc (6,2°), Đông Bắc (38,8°) và Tây Bắc (51,2°); các hướng Đông, Tây gần song song với tuyến đập (góc tới 84 ÷ 96°), các hướng Nam thổi từ phía hạ lưu nên không gây sóng leo lên mái thượng lưu. Đà gió lấy D = 2.970 m khi hồ ở MNDBT và 3.025 m khi hồ ở MNLTK, dùng chung cho mọi hướng (thiên an toàn); cao trình đáy hồ trước đập +59,0 m. Kết quả tính chi tiết với gió hướng Bắc cho trong Bảng 2.4, tổng hợp theo hướng gió trong Bảng 2.5.</w:t>
+        <w:t>Mực nước tính toán: MNDBT = +74,70 m; MNLTK = +77,43 m và MNLKT = +78,39 m – kết quả điều tiết lũ khi các cửa van vận hành bình thường (mục 2.2.3). Tuyến đập có phương vị N96,2°E nên pháp tuyến mái thượng lưu hướng N6,2°E (lòng hồ ở phía Bắc). Sóng được tính cho các hướng gió thổi vào mái thượng lưu với góc tới không quá 60°: Bắc (6,2°), Đông Bắc (38,8°) và Tây Bắc (51,2°); các hướng Đông, Tây gần song song với tuyến đập (góc tới 84 ÷ 96°), các hướng Nam thổi từ phía hạ lưu nên không gây sóng leo lên mái thượng lưu. Đà gió lấy D = 2.970 m khi hồ ở MNDBT và 3.025 m khi hồ ở MNLTK, dùng chung cho mọi hướng (thiên an toàn). Kết quả tính chi tiết với gió hướng Bắc cho trong Bảng 2.4, tổng hợp theo hướng gió trong Bảng 2.5.</w:t>
+      </w:r>
+    </w:p>
+    <w:p>
+      <w:pPr>
+        <w:spacing w:before="120" w:after="0" w:line="288" w:lineRule="auto"/>
+        <w:ind w:firstLine="567"/>
+        <w:jc w:val="both"/>
+      </w:pPr>
+      <w:r>
+        <w:rPr>
+          <w:rFonts w:ascii="Times New Roman" w:hAnsi="Times New Roman" w:eastAsia="Times New Roman"/>
+          <w:b w:val="0"/>
+          <w:i w:val="0"/>
+          <w:sz w:val="26"/>
+        </w:rPr>
+        <w:t>Chiều sâu nước trước đập H tính từ cao trình đáy lòng hồ +59,0 m – cao trình thấp nhất của quan hệ Z ~ F ~ W theo bình đồ khảo sát 2022 (F = 0), không phải cao trình đáy đập +54,0 m dùng để tính chiều cao đập 24,5 m. Với sóng nước sâu, H chỉ ảnh hưởng đến độ dềnh Δh (tỷ lệ nghịch với H): lấy đáy +59,0 m cho H nhỏ hơn nên Δh lớn hơn – thiên an toàn; nếu lấy đáy +54,0 m thì Δh giảm 1 ÷ 3 mm, cao trình đỉnh yêu cầu không đổi.</w:t>
+      </w:r>
+    </w:p>
+    <w:p>
+      <w:pPr>
+        <w:spacing w:before="120" w:after="0" w:line="288" w:lineRule="auto"/>
+        <w:ind w:firstLine="567"/>
+        <w:jc w:val="both"/>
+      </w:pPr>
+      <w:r>
+        <w:rPr>
+          <w:rFonts w:ascii="Times New Roman" w:hAnsi="Times New Roman" w:eastAsia="Times New Roman"/>
+          <w:b w:val="0"/>
+          <w:i w:val="0"/>
+          <w:sz w:val="26"/>
+        </w:rPr>
+        <w:t>Mái thượng lưu có hai đoạn: m = 3,0 từ đỉnh đến cơ +68,0 m và m = 3,5 dưới cơ. Sóng leo được tính với m = 3,0 vì cơ nằm dưới MNDBT 6,70 m và dưới MNLTK 9,43 m, sâu hơn vùng chịu tác động của sóng (0,5λ̄ = 2,9 ÷ 6,4 m – cùng tiêu chí sóng nước sâu của TCVN 8421:2010), nên sóng chỉ vỗ và leo trên đoạn mái m = 3,0; mặt khác mái càng thoải thì sóng leo càng thấp, nên dùng m = 3,0 là thiên an toàn.</w:t>
       </w:r>
     </w:p>
     <w:p>

</xml_diff>